<commit_message>
triggers: remove unused trigger-event lookups
Drop the by-status/product/zone event methods and endpoints the UI never
called, the removed evaluation id field, and an unused measurements URL.
Docs updated for the simplified trigger service.

Co-Authored-By: Claude Opus 5.5 <noreply@anthropic.com>
Claude-Session: https://claude.ai/code/session_019fKBjUjBqb8QnHYe4A7h5k
</commit_message>
<xml_diff>
--- a/docs/ClimateSure_Project_Documentation.docx
+++ b/docs/ClimateSure_Project_Documentation.docx
@@ -14342,7 +14342,7 @@
         <w:spacing w:after="120"/>
       </w:pPr>
       <w:r>
-        <w:t xml:space="preserve">Code: </w:t>
+        <w:t>Code: triggerservice → MeasurementService.compare() (same logic in ProductService.isTriggered).</w:t>
       </w:r>
       <w:r>
         <w:rPr>
@@ -14351,11 +14351,8 @@
           <w:sz w:val="19"/>
           <w:szCs w:val="19"/>
         </w:rPr>
-        <w:t xml:space="preserve">triggerservice → MeasurementService.compare()</w:t>
-      </w:r>
-      <w:r>
-        <w:t xml:space="preserve"> (same logic in TriggerEvaluationService, PolicyTriggerEligibilityService and ProductService.isTriggered).</w:t>
-      </w:r>
+      </w:r>
+      <w:r/>
     </w:p>
     <w:tbl>
       <w:tblPr>
@@ -15611,1046 +15608,7 @@
         <w:pStyle w:val="Heading2"/>
       </w:pPr>
       <w:r>
-        <w:t xml:space="preserve">7.6 Window aggregation engine (observation-based evaluation)</w:t>
-      </w:r>
-    </w:p>
-    <w:p>
-      <w:pPr>
-        <w:spacing w:after="120"/>
-      </w:pPr>
-      <w:r>
-        <w:t xml:space="preserve">Used by the observation/evaluation endpoints (</w:t>
-      </w:r>
-      <w:r>
-        <w:rPr>
-          <w:rFonts w:ascii="Consolas" w:cs="Consolas" w:eastAsia="Consolas" w:hAnsi="Consolas"/>
-          <w:color w:val="9A3412"/>
-          <w:sz w:val="19"/>
-          <w:szCs w:val="19"/>
-        </w:rPr>
-        <w:t xml:space="preserve">POST /api/triggers/demo/observations</w:t>
-      </w:r>
-      <w:r>
-        <w:t xml:space="preserve">, evaluations, monitor runs). It turns many readings inside a time window into one value, then applies the compare in 7.5. Code: </w:t>
-      </w:r>
-      <w:r>
-        <w:rPr>
-          <w:rFonts w:ascii="Consolas" w:cs="Consolas" w:eastAsia="Consolas" w:hAnsi="Consolas"/>
-          <w:color w:val="9A3412"/>
-          <w:sz w:val="19"/>
-          <w:szCs w:val="19"/>
-        </w:rPr>
-        <w:t xml:space="preserve">TriggerEvaluationService.aggregate()</w:t>
-      </w:r>
-      <w:r>
-        <w:t xml:space="preserve"> and </w:t>
-      </w:r>
-      <w:r>
-        <w:rPr>
-          <w:rFonts w:ascii="Consolas" w:cs="Consolas" w:eastAsia="Consolas" w:hAnsi="Consolas"/>
-          <w:color w:val="9A3412"/>
-          <w:sz w:val="19"/>
-          <w:szCs w:val="19"/>
-        </w:rPr>
-        <w:t xml:space="preserve">MonitorRunService</w:t>
-      </w:r>
-      <w:r>
-        <w:t xml:space="preserve">.</w:t>
-      </w:r>
-    </w:p>
-    <w:tbl>
-      <w:tblPr>
-        <w:tblW w:type="dxa" w:w="9026"/>
-        <w:tblBorders>
-          <w:top w:val="single" w:color="auto" w:sz="4"/>
-          <w:left w:val="single" w:color="auto" w:sz="4"/>
-          <w:bottom w:val="single" w:color="auto" w:sz="4"/>
-          <w:right w:val="single" w:color="auto" w:sz="4"/>
-          <w:insideH w:val="single" w:color="auto" w:sz="4"/>
-          <w:insideV w:val="single" w:color="auto" w:sz="4"/>
-        </w:tblBorders>
-      </w:tblPr>
-      <w:tblGrid>
-        <w:gridCol w:w="9026"/>
-      </w:tblGrid>
-      <w:tr>
-        <w:tc>
-          <w:tcPr>
-            <w:tcW w:type="dxa" w:w="9026"/>
-            <w:tcBorders>
-              <w:top w:val="single" w:color="C9D3DF" w:sz="4"/>
-              <w:left w:val="single" w:color="C9D3DF" w:sz="4"/>
-              <w:bottom w:val="single" w:color="C9D3DF" w:sz="4"/>
-              <w:right w:val="single" w:color="C9D3DF" w:sz="4"/>
-            </w:tcBorders>
-            <w:shd w:fill="F3F4F6" w:color="auto" w:val="clear"/>
-            <w:tcMar>
-              <w:top w:type="dxa" w:w="120"/>
-              <w:left w:type="dxa" w:w="180"/>
-              <w:bottom w:type="dxa" w:w="120"/>
-              <w:right w:type="dxa" w:w="180"/>
-            </w:tcMar>
-          </w:tcPr>
-          <w:p>
-            <w:r>
-              <w:rPr>
-                <w:rFonts w:ascii="Consolas" w:cs="Consolas" w:eastAsia="Consolas" w:hAnsi="Consolas"/>
-                <w:sz w:val="17"/>
-                <w:szCs w:val="17"/>
-              </w:rPr>
-              <w:t xml:space="preserve">windowEnd   = now</w:t>
-            </w:r>
-          </w:p>
-          <w:p>
-            <w:r>
-              <w:rPr>
-                <w:rFonts w:ascii="Consolas" w:cs="Consolas" w:eastAsia="Consolas" w:hAnsi="Consolas"/>
-                <w:sz w:val="17"/>
-                <w:szCs w:val="17"/>
-              </w:rPr>
-              <w:t xml:space="preserve">windowStart = now − observationWindowHours</w:t>
-            </w:r>
-          </w:p>
-          <w:p>
-            <w:r>
-              <w:rPr>
-                <w:rFonts w:ascii="Consolas" w:cs="Consolas" w:eastAsia="Consolas" w:hAnsi="Consolas"/>
-                <w:sz w:val="17"/>
-                <w:szCs w:val="17"/>
-              </w:rPr>
-              <w:t xml:space="preserve">readings    = VALIDATED observations of this zone + measurement type + unit in the window</w:t>
-            </w:r>
-          </w:p>
-          <w:p>
-            <w:r>
-              <w:rPr>
-                <w:rFonts w:ascii="Consolas" w:cs="Consolas" w:eastAsia="Consolas" w:hAnsi="Consolas"/>
-                <w:sz w:val="17"/>
-                <w:szCs w:val="17"/>
-              </w:rPr>
-              <w:t xml:space="preserve">n           = count(readings)</w:t>
-            </w:r>
-          </w:p>
-          <w:p>
-            <w:r>
-              <w:rPr>
-                <w:rFonts w:ascii="Consolas" w:cs="Consolas" w:eastAsia="Consolas" w:hAnsi="Consolas"/>
-                <w:sz w:val="17"/>
-                <w:szCs w:val="17"/>
-              </w:rPr>
-              <w:t xml:space="preserve"> </w:t>
-            </w:r>
-          </w:p>
-          <w:p>
-            <w:r>
-              <w:rPr>
-                <w:rFonts w:ascii="Consolas" w:cs="Consolas" w:eastAsia="Consolas" w:hAnsi="Consolas"/>
-                <w:sz w:val="17"/>
-                <w:szCs w:val="17"/>
-              </w:rPr>
-              <w:t xml:space="preserve">if n &lt; minimumObservationCount → INSUFFICIENT_OBSERVATIONS</w:t>
-            </w:r>
-          </w:p>
-          <w:p>
-            <w:r>
-              <w:rPr>
-                <w:rFonts w:ascii="Consolas" w:cs="Consolas" w:eastAsia="Consolas" w:hAnsi="Consolas"/>
-                <w:sz w:val="17"/>
-                <w:szCs w:val="17"/>
-              </w:rPr>
-              <w:t xml:space="preserve">else aggregated =</w:t>
-            </w:r>
-          </w:p>
-          <w:p>
-            <w:r>
-              <w:rPr>
-                <w:rFonts w:ascii="Consolas" w:cs="Consolas" w:eastAsia="Consolas" w:hAnsi="Consolas"/>
-                <w:sz w:val="17"/>
-                <w:szCs w:val="17"/>
-              </w:rPr>
-              <w:t xml:space="preserve">   SUM      = r1 + r2 + … + rn</w:t>
-            </w:r>
-          </w:p>
-          <w:p>
-            <w:r>
-              <w:rPr>
-                <w:rFonts w:ascii="Consolas" w:cs="Consolas" w:eastAsia="Consolas" w:hAnsi="Consolas"/>
-                <w:sz w:val="17"/>
-                <w:szCs w:val="17"/>
-              </w:rPr>
-              <w:t xml:space="preserve">   AVERAGE  = (r1 + … + rn) ÷ n            (4 decimals, HALF_UP)</w:t>
-            </w:r>
-          </w:p>
-          <w:p>
-            <w:r>
-              <w:rPr>
-                <w:rFonts w:ascii="Consolas" w:cs="Consolas" w:eastAsia="Consolas" w:hAnsi="Consolas"/>
-                <w:sz w:val="17"/>
-                <w:szCs w:val="17"/>
-              </w:rPr>
-              <w:t xml:space="preserve">   MINIMUM  = smallest reading</w:t>
-            </w:r>
-          </w:p>
-          <w:p>
-            <w:r>
-              <w:rPr>
-                <w:rFonts w:ascii="Consolas" w:cs="Consolas" w:eastAsia="Consolas" w:hAnsi="Consolas"/>
-                <w:sz w:val="17"/>
-                <w:szCs w:val="17"/>
-              </w:rPr>
-              <w:t xml:space="preserve">   MAXIMUM  = largest reading</w:t>
-            </w:r>
-          </w:p>
-          <w:p>
-            <w:r>
-              <w:rPr>
-                <w:rFonts w:ascii="Consolas" w:cs="Consolas" w:eastAsia="Consolas" w:hAnsi="Consolas"/>
-                <w:sz w:val="17"/>
-                <w:szCs w:val="17"/>
-              </w:rPr>
-              <w:t xml:space="preserve">   LATEST   = reading with the newest observedAt</w:t>
-            </w:r>
-          </w:p>
-          <w:p>
-            <w:r>
-              <w:rPr>
-                <w:rFonts w:ascii="Consolas" w:cs="Consolas" w:eastAsia="Consolas" w:hAnsi="Consolas"/>
-                <w:sz w:val="17"/>
-                <w:szCs w:val="17"/>
-              </w:rPr>
-              <w:t xml:space="preserve">result = compare(aggregated, threshold, operator) ? MATCHED : NOT_MATCHED</w:t>
-            </w:r>
-          </w:p>
-        </w:tc>
-      </w:tr>
-    </w:tbl>
-    <w:p>
-      <w:pPr>
-        <w:spacing w:after="80"/>
-      </w:pPr>
-    </w:p>
-    <w:tbl>
-      <w:tblPr>
-        <w:tblW w:type="dxa" w:w="9026"/>
-        <w:tblBorders>
-          <w:top w:val="single" w:color="auto" w:sz="4"/>
-          <w:left w:val="single" w:color="auto" w:sz="4"/>
-          <w:bottom w:val="single" w:color="auto" w:sz="4"/>
-          <w:right w:val="single" w:color="auto" w:sz="4"/>
-          <w:insideH w:val="single" w:color="auto" w:sz="4"/>
-          <w:insideV w:val="single" w:color="auto" w:sz="4"/>
-        </w:tblBorders>
-      </w:tblPr>
-      <w:tblGrid>
-        <w:gridCol w:w="2707"/>
-        <w:gridCol w:w="2166"/>
-        <w:gridCol w:w="2346"/>
-        <w:gridCol w:w="1807"/>
-      </w:tblGrid>
-      <w:tr>
-        <w:trPr>
-          <w:tblHeader/>
-        </w:trPr>
-        <w:tc>
-          <w:tcPr>
-            <w:tcW w:type="dxa" w:w="2707"/>
-            <w:tcBorders>
-              <w:top w:val="single" w:color="C9D3DF" w:sz="4"/>
-              <w:left w:val="single" w:color="C9D3DF" w:sz="4"/>
-              <w:bottom w:val="single" w:color="C9D3DF" w:sz="4"/>
-              <w:right w:val="single" w:color="C9D3DF" w:sz="4"/>
-            </w:tcBorders>
-            <w:shd w:fill="1F4E79" w:color="auto" w:val="clear"/>
-            <w:tcMar>
-              <w:top w:type="dxa" w:w="60"/>
-              <w:left w:type="dxa" w:w="100"/>
-              <w:bottom w:type="dxa" w:w="60"/>
-              <w:right w:type="dxa" w:w="100"/>
-            </w:tcMar>
-          </w:tcPr>
-          <w:p>
-            <w:r>
-              <w:rPr>
-                <w:b/>
-                <w:bCs/>
-                <w:color w:val="FFFFFF"/>
-                <w:sz w:val="19"/>
-                <w:szCs w:val="19"/>
-              </w:rPr>
-              <w:t xml:space="preserve">Rule</w:t>
-            </w:r>
-          </w:p>
-        </w:tc>
-        <w:tc>
-          <w:tcPr>
-            <w:tcW w:type="dxa" w:w="2166"/>
-            <w:tcBorders>
-              <w:top w:val="single" w:color="C9D3DF" w:sz="4"/>
-              <w:left w:val="single" w:color="C9D3DF" w:sz="4"/>
-              <w:bottom w:val="single" w:color="C9D3DF" w:sz="4"/>
-              <w:right w:val="single" w:color="C9D3DF" w:sz="4"/>
-            </w:tcBorders>
-            <w:shd w:fill="1F4E79" w:color="auto" w:val="clear"/>
-            <w:tcMar>
-              <w:top w:type="dxa" w:w="60"/>
-              <w:left w:type="dxa" w:w="100"/>
-              <w:bottom w:type="dxa" w:w="60"/>
-              <w:right w:type="dxa" w:w="100"/>
-            </w:tcMar>
-          </w:tcPr>
-          <w:p>
-            <w:r>
-              <w:rPr>
-                <w:b/>
-                <w:bCs/>
-                <w:color w:val="FFFFFF"/>
-                <w:sz w:val="19"/>
-                <w:szCs w:val="19"/>
-              </w:rPr>
-              <w:t xml:space="preserve">Readings in window</w:t>
-            </w:r>
-          </w:p>
-        </w:tc>
-        <w:tc>
-          <w:tcPr>
-            <w:tcW w:type="dxa" w:w="2346"/>
-            <w:tcBorders>
-              <w:top w:val="single" w:color="C9D3DF" w:sz="4"/>
-              <w:left w:val="single" w:color="C9D3DF" w:sz="4"/>
-              <w:bottom w:val="single" w:color="C9D3DF" w:sz="4"/>
-              <w:right w:val="single" w:color="C9D3DF" w:sz="4"/>
-            </w:tcBorders>
-            <w:shd w:fill="1F4E79" w:color="auto" w:val="clear"/>
-            <w:tcMar>
-              <w:top w:type="dxa" w:w="60"/>
-              <w:left w:type="dxa" w:w="100"/>
-              <w:bottom w:type="dxa" w:w="60"/>
-              <w:right w:type="dxa" w:w="100"/>
-            </w:tcMar>
-          </w:tcPr>
-          <w:p>
-            <w:r>
-              <w:rPr>
-                <w:b/>
-                <w:bCs/>
-                <w:color w:val="FFFFFF"/>
-                <w:sz w:val="19"/>
-                <w:szCs w:val="19"/>
-              </w:rPr>
-              <w:t xml:space="preserve">Aggregated</w:t>
-            </w:r>
-          </w:p>
-        </w:tc>
-        <w:tc>
-          <w:tcPr>
-            <w:tcW w:type="dxa" w:w="1807"/>
-            <w:tcBorders>
-              <w:top w:val="single" w:color="C9D3DF" w:sz="4"/>
-              <w:left w:val="single" w:color="C9D3DF" w:sz="4"/>
-              <w:bottom w:val="single" w:color="C9D3DF" w:sz="4"/>
-              <w:right w:val="single" w:color="C9D3DF" w:sz="4"/>
-            </w:tcBorders>
-            <w:shd w:fill="1F4E79" w:color="auto" w:val="clear"/>
-            <w:tcMar>
-              <w:top w:type="dxa" w:w="60"/>
-              <w:left w:type="dxa" w:w="100"/>
-              <w:bottom w:type="dxa" w:w="60"/>
-              <w:right w:type="dxa" w:w="100"/>
-            </w:tcMar>
-          </w:tcPr>
-          <w:p>
-            <w:r>
-              <w:rPr>
-                <w:b/>
-                <w:bCs/>
-                <w:color w:val="FFFFFF"/>
-                <w:sz w:val="19"/>
-                <w:szCs w:val="19"/>
-              </w:rPr>
-              <w:t xml:space="preserve">Result</w:t>
-            </w:r>
-          </w:p>
-        </w:tc>
-      </w:tr>
-      <w:tr>
-        <w:tc>
-          <w:tcPr>
-            <w:tcW w:type="dxa" w:w="2707"/>
-            <w:tcBorders>
-              <w:top w:val="single" w:color="C9D3DF" w:sz="4"/>
-              <w:left w:val="single" w:color="C9D3DF" w:sz="4"/>
-              <w:bottom w:val="single" w:color="C9D3DF" w:sz="4"/>
-              <w:right w:val="single" w:color="C9D3DF" w:sz="4"/>
-            </w:tcBorders>
-            <w:tcMar>
-              <w:top w:type="dxa" w:w="60"/>
-              <w:left w:type="dxa" w:w="100"/>
-              <w:bottom w:type="dxa" w:w="60"/>
-              <w:right w:type="dxa" w:w="100"/>
-            </w:tcMar>
-          </w:tcPr>
-          <w:p>
-            <w:r>
-              <w:rPr>
-                <w:sz w:val="19"/>
-                <w:szCs w:val="19"/>
-              </w:rPr>
-              <w:t xml:space="preserve">Rainfall SUM ≥ 150 mm / 24 h</w:t>
-            </w:r>
-          </w:p>
-        </w:tc>
-        <w:tc>
-          <w:tcPr>
-            <w:tcW w:type="dxa" w:w="2166"/>
-            <w:tcBorders>
-              <w:top w:val="single" w:color="C9D3DF" w:sz="4"/>
-              <w:left w:val="single" w:color="C9D3DF" w:sz="4"/>
-              <w:bottom w:val="single" w:color="C9D3DF" w:sz="4"/>
-              <w:right w:val="single" w:color="C9D3DF" w:sz="4"/>
-            </w:tcBorders>
-            <w:tcMar>
-              <w:top w:type="dxa" w:w="60"/>
-              <w:left w:type="dxa" w:w="100"/>
-              <w:bottom w:type="dxa" w:w="60"/>
-              <w:right w:type="dxa" w:w="100"/>
-            </w:tcMar>
-          </w:tcPr>
-          <w:p>
-            <w:r>
-              <w:rPr>
-                <w:sz w:val="19"/>
-                <w:szCs w:val="19"/>
-              </w:rPr>
-              <w:t xml:space="preserve">40, 60, 55 mm</w:t>
-            </w:r>
-          </w:p>
-        </w:tc>
-        <w:tc>
-          <w:tcPr>
-            <w:tcW w:type="dxa" w:w="2346"/>
-            <w:tcBorders>
-              <w:top w:val="single" w:color="C9D3DF" w:sz="4"/>
-              <w:left w:val="single" w:color="C9D3DF" w:sz="4"/>
-              <w:bottom w:val="single" w:color="C9D3DF" w:sz="4"/>
-              <w:right w:val="single" w:color="C9D3DF" w:sz="4"/>
-            </w:tcBorders>
-            <w:tcMar>
-              <w:top w:type="dxa" w:w="60"/>
-              <w:left w:type="dxa" w:w="100"/>
-              <w:bottom w:type="dxa" w:w="60"/>
-              <w:right w:type="dxa" w:w="100"/>
-            </w:tcMar>
-          </w:tcPr>
-          <w:p>
-            <w:r>
-              <w:rPr>
-                <w:sz w:val="19"/>
-                <w:szCs w:val="19"/>
-              </w:rPr>
-              <w:t xml:space="preserve">SUM = 155</w:t>
-            </w:r>
-          </w:p>
-        </w:tc>
-        <w:tc>
-          <w:tcPr>
-            <w:tcW w:type="dxa" w:w="1807"/>
-            <w:tcBorders>
-              <w:top w:val="single" w:color="C9D3DF" w:sz="4"/>
-              <w:left w:val="single" w:color="C9D3DF" w:sz="4"/>
-              <w:bottom w:val="single" w:color="C9D3DF" w:sz="4"/>
-              <w:right w:val="single" w:color="C9D3DF" w:sz="4"/>
-            </w:tcBorders>
-            <w:tcMar>
-              <w:top w:type="dxa" w:w="60"/>
-              <w:left w:type="dxa" w:w="100"/>
-              <w:bottom w:type="dxa" w:w="60"/>
-              <w:right w:type="dxa" w:w="100"/>
-            </w:tcMar>
-          </w:tcPr>
-          <w:p>
-            <w:r>
-              <w:rPr>
-                <w:sz w:val="19"/>
-                <w:szCs w:val="19"/>
-              </w:rPr>
-              <w:t xml:space="preserve">MATCHED</w:t>
-            </w:r>
-          </w:p>
-        </w:tc>
-      </w:tr>
-      <w:tr>
-        <w:tc>
-          <w:tcPr>
-            <w:tcW w:type="dxa" w:w="2707"/>
-            <w:tcBorders>
-              <w:top w:val="single" w:color="C9D3DF" w:sz="4"/>
-              <w:left w:val="single" w:color="C9D3DF" w:sz="4"/>
-              <w:bottom w:val="single" w:color="C9D3DF" w:sz="4"/>
-              <w:right w:val="single" w:color="C9D3DF" w:sz="4"/>
-            </w:tcBorders>
-            <w:shd w:fill="F3F4F6" w:color="auto" w:val="clear"/>
-            <w:tcMar>
-              <w:top w:type="dxa" w:w="60"/>
-              <w:left w:type="dxa" w:w="100"/>
-              <w:bottom w:type="dxa" w:w="60"/>
-              <w:right w:type="dxa" w:w="100"/>
-            </w:tcMar>
-          </w:tcPr>
-          <w:p>
-            <w:r>
-              <w:rPr>
-                <w:sz w:val="19"/>
-                <w:szCs w:val="19"/>
-              </w:rPr>
-              <w:t xml:space="preserve">Rainfall AVERAGE ≥ 50 mm</w:t>
-            </w:r>
-          </w:p>
-        </w:tc>
-        <w:tc>
-          <w:tcPr>
-            <w:tcW w:type="dxa" w:w="2166"/>
-            <w:tcBorders>
-              <w:top w:val="single" w:color="C9D3DF" w:sz="4"/>
-              <w:left w:val="single" w:color="C9D3DF" w:sz="4"/>
-              <w:bottom w:val="single" w:color="C9D3DF" w:sz="4"/>
-              <w:right w:val="single" w:color="C9D3DF" w:sz="4"/>
-            </w:tcBorders>
-            <w:shd w:fill="F3F4F6" w:color="auto" w:val="clear"/>
-            <w:tcMar>
-              <w:top w:type="dxa" w:w="60"/>
-              <w:left w:type="dxa" w:w="100"/>
-              <w:bottom w:type="dxa" w:w="60"/>
-              <w:right w:type="dxa" w:w="100"/>
-            </w:tcMar>
-          </w:tcPr>
-          <w:p>
-            <w:r>
-              <w:rPr>
-                <w:sz w:val="19"/>
-                <w:szCs w:val="19"/>
-              </w:rPr>
-              <w:t xml:space="preserve">40, 60, 55 mm</w:t>
-            </w:r>
-          </w:p>
-        </w:tc>
-        <w:tc>
-          <w:tcPr>
-            <w:tcW w:type="dxa" w:w="2346"/>
-            <w:tcBorders>
-              <w:top w:val="single" w:color="C9D3DF" w:sz="4"/>
-              <w:left w:val="single" w:color="C9D3DF" w:sz="4"/>
-              <w:bottom w:val="single" w:color="C9D3DF" w:sz="4"/>
-              <w:right w:val="single" w:color="C9D3DF" w:sz="4"/>
-            </w:tcBorders>
-            <w:shd w:fill="F3F4F6" w:color="auto" w:val="clear"/>
-            <w:tcMar>
-              <w:top w:type="dxa" w:w="60"/>
-              <w:left w:type="dxa" w:w="100"/>
-              <w:bottom w:type="dxa" w:w="60"/>
-              <w:right w:type="dxa" w:w="100"/>
-            </w:tcMar>
-          </w:tcPr>
-          <w:p>
-            <w:r>
-              <w:rPr>
-                <w:sz w:val="19"/>
-                <w:szCs w:val="19"/>
-              </w:rPr>
-              <w:t xml:space="preserve">155 ÷ 3 = 51.6667</w:t>
-            </w:r>
-          </w:p>
-        </w:tc>
-        <w:tc>
-          <w:tcPr>
-            <w:tcW w:type="dxa" w:w="1807"/>
-            <w:tcBorders>
-              <w:top w:val="single" w:color="C9D3DF" w:sz="4"/>
-              <w:left w:val="single" w:color="C9D3DF" w:sz="4"/>
-              <w:bottom w:val="single" w:color="C9D3DF" w:sz="4"/>
-              <w:right w:val="single" w:color="C9D3DF" w:sz="4"/>
-            </w:tcBorders>
-            <w:shd w:fill="F3F4F6" w:color="auto" w:val="clear"/>
-            <w:tcMar>
-              <w:top w:type="dxa" w:w="60"/>
-              <w:left w:type="dxa" w:w="100"/>
-              <w:bottom w:type="dxa" w:w="60"/>
-              <w:right w:type="dxa" w:w="100"/>
-            </w:tcMar>
-          </w:tcPr>
-          <w:p>
-            <w:r>
-              <w:rPr>
-                <w:sz w:val="19"/>
-                <w:szCs w:val="19"/>
-              </w:rPr>
-              <w:t xml:space="preserve">MATCHED</w:t>
-            </w:r>
-          </w:p>
-        </w:tc>
-      </w:tr>
-      <w:tr>
-        <w:tc>
-          <w:tcPr>
-            <w:tcW w:type="dxa" w:w="2707"/>
-            <w:tcBorders>
-              <w:top w:val="single" w:color="C9D3DF" w:sz="4"/>
-              <w:left w:val="single" w:color="C9D3DF" w:sz="4"/>
-              <w:bottom w:val="single" w:color="C9D3DF" w:sz="4"/>
-              <w:right w:val="single" w:color="C9D3DF" w:sz="4"/>
-            </w:tcBorders>
-            <w:tcMar>
-              <w:top w:type="dxa" w:w="60"/>
-              <w:left w:type="dxa" w:w="100"/>
-              <w:bottom w:type="dxa" w:w="60"/>
-              <w:right w:type="dxa" w:w="100"/>
-            </w:tcMar>
-          </w:tcPr>
-          <w:p>
-            <w:r>
-              <w:rPr>
-                <w:sz w:val="19"/>
-                <w:szCs w:val="19"/>
-              </w:rPr>
-              <w:t xml:space="preserve">Flood MAX ≥ 5 m / 6 h</w:t>
-            </w:r>
-          </w:p>
-        </w:tc>
-        <w:tc>
-          <w:tcPr>
-            <w:tcW w:type="dxa" w:w="2166"/>
-            <w:tcBorders>
-              <w:top w:val="single" w:color="C9D3DF" w:sz="4"/>
-              <w:left w:val="single" w:color="C9D3DF" w:sz="4"/>
-              <w:bottom w:val="single" w:color="C9D3DF" w:sz="4"/>
-              <w:right w:val="single" w:color="C9D3DF" w:sz="4"/>
-            </w:tcBorders>
-            <w:tcMar>
-              <w:top w:type="dxa" w:w="60"/>
-              <w:left w:type="dxa" w:w="100"/>
-              <w:bottom w:type="dxa" w:w="60"/>
-              <w:right w:type="dxa" w:w="100"/>
-            </w:tcMar>
-          </w:tcPr>
-          <w:p>
-            <w:r>
-              <w:rPr>
-                <w:sz w:val="19"/>
-                <w:szCs w:val="19"/>
-              </w:rPr>
-              <w:t xml:space="preserve">3.2, 4.8, 5.1 m</w:t>
-            </w:r>
-          </w:p>
-        </w:tc>
-        <w:tc>
-          <w:tcPr>
-            <w:tcW w:type="dxa" w:w="2346"/>
-            <w:tcBorders>
-              <w:top w:val="single" w:color="C9D3DF" w:sz="4"/>
-              <w:left w:val="single" w:color="C9D3DF" w:sz="4"/>
-              <w:bottom w:val="single" w:color="C9D3DF" w:sz="4"/>
-              <w:right w:val="single" w:color="C9D3DF" w:sz="4"/>
-            </w:tcBorders>
-            <w:tcMar>
-              <w:top w:type="dxa" w:w="60"/>
-              <w:left w:type="dxa" w:w="100"/>
-              <w:bottom w:type="dxa" w:w="60"/>
-              <w:right w:type="dxa" w:w="100"/>
-            </w:tcMar>
-          </w:tcPr>
-          <w:p>
-            <w:r>
-              <w:rPr>
-                <w:sz w:val="19"/>
-                <w:szCs w:val="19"/>
-              </w:rPr>
-              <w:t xml:space="preserve">MAX = 5.1</w:t>
-            </w:r>
-          </w:p>
-        </w:tc>
-        <w:tc>
-          <w:tcPr>
-            <w:tcW w:type="dxa" w:w="1807"/>
-            <w:tcBorders>
-              <w:top w:val="single" w:color="C9D3DF" w:sz="4"/>
-              <w:left w:val="single" w:color="C9D3DF" w:sz="4"/>
-              <w:bottom w:val="single" w:color="C9D3DF" w:sz="4"/>
-              <w:right w:val="single" w:color="C9D3DF" w:sz="4"/>
-            </w:tcBorders>
-            <w:tcMar>
-              <w:top w:type="dxa" w:w="60"/>
-              <w:left w:type="dxa" w:w="100"/>
-              <w:bottom w:type="dxa" w:w="60"/>
-              <w:right w:type="dxa" w:w="100"/>
-            </w:tcMar>
-          </w:tcPr>
-          <w:p>
-            <w:r>
-              <w:rPr>
-                <w:sz w:val="19"/>
-                <w:szCs w:val="19"/>
-              </w:rPr>
-              <w:t xml:space="preserve">MATCHED</w:t>
-            </w:r>
-          </w:p>
-        </w:tc>
-      </w:tr>
-      <w:tr>
-        <w:tc>
-          <w:tcPr>
-            <w:tcW w:type="dxa" w:w="2707"/>
-            <w:tcBorders>
-              <w:top w:val="single" w:color="C9D3DF" w:sz="4"/>
-              <w:left w:val="single" w:color="C9D3DF" w:sz="4"/>
-              <w:bottom w:val="single" w:color="C9D3DF" w:sz="4"/>
-              <w:right w:val="single" w:color="C9D3DF" w:sz="4"/>
-            </w:tcBorders>
-            <w:shd w:fill="F3F4F6" w:color="auto" w:val="clear"/>
-            <w:tcMar>
-              <w:top w:type="dxa" w:w="60"/>
-              <w:left w:type="dxa" w:w="100"/>
-              <w:bottom w:type="dxa" w:w="60"/>
-              <w:right w:type="dxa" w:w="100"/>
-            </w:tcMar>
-          </w:tcPr>
-          <w:p>
-            <w:r>
-              <w:rPr>
-                <w:sz w:val="19"/>
-                <w:szCs w:val="19"/>
-              </w:rPr>
-              <w:t xml:space="preserve">Temperature LATEST ≥ 45 °C</w:t>
-            </w:r>
-          </w:p>
-        </w:tc>
-        <w:tc>
-          <w:tcPr>
-            <w:tcW w:type="dxa" w:w="2166"/>
-            <w:tcBorders>
-              <w:top w:val="single" w:color="C9D3DF" w:sz="4"/>
-              <w:left w:val="single" w:color="C9D3DF" w:sz="4"/>
-              <w:bottom w:val="single" w:color="C9D3DF" w:sz="4"/>
-              <w:right w:val="single" w:color="C9D3DF" w:sz="4"/>
-            </w:tcBorders>
-            <w:shd w:fill="F3F4F6" w:color="auto" w:val="clear"/>
-            <w:tcMar>
-              <w:top w:type="dxa" w:w="60"/>
-              <w:left w:type="dxa" w:w="100"/>
-              <w:bottom w:type="dxa" w:w="60"/>
-              <w:right w:type="dxa" w:w="100"/>
-            </w:tcMar>
-          </w:tcPr>
-          <w:p>
-            <w:r>
-              <w:rPr>
-                <w:sz w:val="19"/>
-                <w:szCs w:val="19"/>
-              </w:rPr>
-              <w:t xml:space="preserve">44 (10:00), 46 (11:00)</w:t>
-            </w:r>
-          </w:p>
-        </w:tc>
-        <w:tc>
-          <w:tcPr>
-            <w:tcW w:type="dxa" w:w="2346"/>
-            <w:tcBorders>
-              <w:top w:val="single" w:color="C9D3DF" w:sz="4"/>
-              <w:left w:val="single" w:color="C9D3DF" w:sz="4"/>
-              <w:bottom w:val="single" w:color="C9D3DF" w:sz="4"/>
-              <w:right w:val="single" w:color="C9D3DF" w:sz="4"/>
-            </w:tcBorders>
-            <w:shd w:fill="F3F4F6" w:color="auto" w:val="clear"/>
-            <w:tcMar>
-              <w:top w:type="dxa" w:w="60"/>
-              <w:left w:type="dxa" w:w="100"/>
-              <w:bottom w:type="dxa" w:w="60"/>
-              <w:right w:type="dxa" w:w="100"/>
-            </w:tcMar>
-          </w:tcPr>
-          <w:p>
-            <w:r>
-              <w:rPr>
-                <w:sz w:val="19"/>
-                <w:szCs w:val="19"/>
-              </w:rPr>
-              <w:t xml:space="preserve">LATEST = 46</w:t>
-            </w:r>
-          </w:p>
-        </w:tc>
-        <w:tc>
-          <w:tcPr>
-            <w:tcW w:type="dxa" w:w="1807"/>
-            <w:tcBorders>
-              <w:top w:val="single" w:color="C9D3DF" w:sz="4"/>
-              <w:left w:val="single" w:color="C9D3DF" w:sz="4"/>
-              <w:bottom w:val="single" w:color="C9D3DF" w:sz="4"/>
-              <w:right w:val="single" w:color="C9D3DF" w:sz="4"/>
-            </w:tcBorders>
-            <w:shd w:fill="F3F4F6" w:color="auto" w:val="clear"/>
-            <w:tcMar>
-              <w:top w:type="dxa" w:w="60"/>
-              <w:left w:type="dxa" w:w="100"/>
-              <w:bottom w:type="dxa" w:w="60"/>
-              <w:right w:type="dxa" w:w="100"/>
-            </w:tcMar>
-          </w:tcPr>
-          <w:p>
-            <w:r>
-              <w:rPr>
-                <w:sz w:val="19"/>
-                <w:szCs w:val="19"/>
-              </w:rPr>
-              <w:t xml:space="preserve">MATCHED</w:t>
-            </w:r>
-          </w:p>
-        </w:tc>
-      </w:tr>
-      <w:tr>
-        <w:tc>
-          <w:tcPr>
-            <w:tcW w:type="dxa" w:w="2707"/>
-            <w:tcBorders>
-              <w:top w:val="single" w:color="C9D3DF" w:sz="4"/>
-              <w:left w:val="single" w:color="C9D3DF" w:sz="4"/>
-              <w:bottom w:val="single" w:color="C9D3DF" w:sz="4"/>
-              <w:right w:val="single" w:color="C9D3DF" w:sz="4"/>
-            </w:tcBorders>
-            <w:tcMar>
-              <w:top w:type="dxa" w:w="60"/>
-              <w:left w:type="dxa" w:w="100"/>
-              <w:bottom w:type="dxa" w:w="60"/>
-              <w:right w:type="dxa" w:w="100"/>
-            </w:tcMar>
-          </w:tcPr>
-          <w:p>
-            <w:r>
-              <w:rPr>
-                <w:sz w:val="19"/>
-                <w:szCs w:val="19"/>
-              </w:rPr>
-              <w:t xml:space="preserve">Any rule with min 3 readings</w:t>
-            </w:r>
-          </w:p>
-        </w:tc>
-        <w:tc>
-          <w:tcPr>
-            <w:tcW w:type="dxa" w:w="2166"/>
-            <w:tcBorders>
-              <w:top w:val="single" w:color="C9D3DF" w:sz="4"/>
-              <w:left w:val="single" w:color="C9D3DF" w:sz="4"/>
-              <w:bottom w:val="single" w:color="C9D3DF" w:sz="4"/>
-              <w:right w:val="single" w:color="C9D3DF" w:sz="4"/>
-            </w:tcBorders>
-            <w:tcMar>
-              <w:top w:type="dxa" w:w="60"/>
-              <w:left w:type="dxa" w:w="100"/>
-              <w:bottom w:type="dxa" w:w="60"/>
-              <w:right w:type="dxa" w:w="100"/>
-            </w:tcMar>
-          </w:tcPr>
-          <w:p>
-            <w:r>
-              <w:rPr>
-                <w:sz w:val="19"/>
-                <w:szCs w:val="19"/>
-              </w:rPr>
-              <w:t xml:space="preserve">only 2 readings</w:t>
-            </w:r>
-          </w:p>
-        </w:tc>
-        <w:tc>
-          <w:tcPr>
-            <w:tcW w:type="dxa" w:w="2346"/>
-            <w:tcBorders>
-              <w:top w:val="single" w:color="C9D3DF" w:sz="4"/>
-              <w:left w:val="single" w:color="C9D3DF" w:sz="4"/>
-              <w:bottom w:val="single" w:color="C9D3DF" w:sz="4"/>
-              <w:right w:val="single" w:color="C9D3DF" w:sz="4"/>
-            </w:tcBorders>
-            <w:tcMar>
-              <w:top w:type="dxa" w:w="60"/>
-              <w:left w:type="dxa" w:w="100"/>
-              <w:bottom w:type="dxa" w:w="60"/>
-              <w:right w:type="dxa" w:w="100"/>
-            </w:tcMar>
-          </w:tcPr>
-          <w:p>
-            <w:r>
-              <w:rPr>
-                <w:sz w:val="19"/>
-                <w:szCs w:val="19"/>
-              </w:rPr>
-              <w:t xml:space="preserve">—</w:t>
-            </w:r>
-          </w:p>
-        </w:tc>
-        <w:tc>
-          <w:tcPr>
-            <w:tcW w:type="dxa" w:w="1807"/>
-            <w:tcBorders>
-              <w:top w:val="single" w:color="C9D3DF" w:sz="4"/>
-              <w:left w:val="single" w:color="C9D3DF" w:sz="4"/>
-              <w:bottom w:val="single" w:color="C9D3DF" w:sz="4"/>
-              <w:right w:val="single" w:color="C9D3DF" w:sz="4"/>
-            </w:tcBorders>
-            <w:tcMar>
-              <w:top w:type="dxa" w:w="60"/>
-              <w:left w:type="dxa" w:w="100"/>
-              <w:bottom w:type="dxa" w:w="60"/>
-              <w:right w:type="dxa" w:w="100"/>
-            </w:tcMar>
-          </w:tcPr>
-          <w:p>
-            <w:r>
-              <w:rPr>
-                <w:sz w:val="19"/>
-                <w:szCs w:val="19"/>
-              </w:rPr>
-              <w:t xml:space="preserve">INSUFFICIENT_OBSERVATIONS</w:t>
-            </w:r>
-          </w:p>
-        </w:tc>
-      </w:tr>
-    </w:tbl>
-    <w:p>
-      <w:pPr>
-        <w:pStyle w:val="Heading3"/>
-      </w:pPr>
-      <w:r>
-        <w:t xml:space="preserve">Demo simulation — generated “crossing” readings (DemoSimulationService)</w:t>
-      </w:r>
-    </w:p>
-    <w:tbl>
-      <w:tblPr>
-        <w:tblW w:type="dxa" w:w="9026"/>
-        <w:tblBorders>
-          <w:top w:val="single" w:color="auto" w:sz="4"/>
-          <w:left w:val="single" w:color="auto" w:sz="4"/>
-          <w:bottom w:val="single" w:color="auto" w:sz="4"/>
-          <w:right w:val="single" w:color="auto" w:sz="4"/>
-          <w:insideH w:val="single" w:color="auto" w:sz="4"/>
-          <w:insideV w:val="single" w:color="auto" w:sz="4"/>
-        </w:tblBorders>
-      </w:tblPr>
-      <w:tblGrid>
-        <w:gridCol w:w="9026"/>
-      </w:tblGrid>
-      <w:tr>
-        <w:tc>
-          <w:tcPr>
-            <w:tcW w:type="dxa" w:w="9026"/>
-            <w:tcBorders>
-              <w:top w:val="single" w:color="C9D3DF" w:sz="4"/>
-              <w:left w:val="single" w:color="C9D3DF" w:sz="4"/>
-              <w:bottom w:val="single" w:color="C9D3DF" w:sz="4"/>
-              <w:right w:val="single" w:color="C9D3DF" w:sz="4"/>
-            </w:tcBorders>
-            <w:shd w:fill="F3F4F6" w:color="auto" w:val="clear"/>
-            <w:tcMar>
-              <w:top w:type="dxa" w:w="120"/>
-              <w:left w:type="dxa" w:w="180"/>
-              <w:bottom w:type="dxa" w:w="120"/>
-              <w:right w:type="dxa" w:w="180"/>
-            </w:tcMar>
-          </w:tcPr>
-          <w:p>
-            <w:r>
-              <w:rPr>
-                <w:rFonts w:ascii="Consolas" w:cs="Consolas" w:eastAsia="Consolas" w:hAnsi="Consolas"/>
-                <w:sz w:val="17"/>
-                <w:szCs w:val="17"/>
-              </w:rPr>
-              <w:t xml:space="preserve">count = MAX(observationWindowHours, minimumObservationCount, 1)</w:t>
-            </w:r>
-          </w:p>
-          <w:p>
-            <w:r>
-              <w:rPr>
-                <w:rFonts w:ascii="Consolas" w:cs="Consolas" w:eastAsia="Consolas" w:hAnsi="Consolas"/>
-                <w:sz w:val="17"/>
-                <w:szCs w:val="17"/>
-              </w:rPr>
-              <w:t xml:space="preserve">margin = 1.10 for &gt;, ≥, =      |   0.90 for &lt;, ≤</w:t>
-            </w:r>
-          </w:p>
-          <w:p>
-            <w:r>
-              <w:rPr>
-                <w:rFonts w:ascii="Consolas" w:cs="Consolas" w:eastAsia="Consolas" w:hAnsi="Consolas"/>
-                <w:sz w:val="17"/>
-                <w:szCs w:val="17"/>
-              </w:rPr>
-              <w:t xml:space="preserve">SUM rule                       :  eachReading = threshold × margin ÷ count   (4 dp)</w:t>
-            </w:r>
-          </w:p>
-          <w:p>
-            <w:r>
-              <w:rPr>
-                <w:rFonts w:ascii="Consolas" w:cs="Consolas" w:eastAsia="Consolas" w:hAnsi="Consolas"/>
-                <w:sz w:val="17"/>
-                <w:szCs w:val="17"/>
-              </w:rPr>
-              <w:t xml:space="preserve">AVERAGE / MIN / MAX / LATEST   :  eachReading = threshold × margin</w:t>
-            </w:r>
-          </w:p>
-          <w:p>
-            <w:r>
-              <w:rPr>
-                <w:rFonts w:ascii="Consolas" w:cs="Consolas" w:eastAsia="Consolas" w:hAnsi="Consolas"/>
-                <w:sz w:val="17"/>
-                <w:szCs w:val="17"/>
-              </w:rPr>
-              <w:t xml:space="preserve">timestamp of reading i = now − MAX(windowMinutes × (i+1) ÷ count, 1) minutes</w:t>
-            </w:r>
-          </w:p>
-          <w:p>
-            <w:r>
-              <w:rPr>
-                <w:rFonts w:ascii="Consolas" w:cs="Consolas" w:eastAsia="Consolas" w:hAnsi="Consolas"/>
-                <w:sz w:val="17"/>
-                <w:szCs w:val="17"/>
-              </w:rPr>
-              <w:t xml:space="preserve"> </w:t>
-            </w:r>
-          </w:p>
-          <w:p>
-            <w:r>
-              <w:rPr>
-                <w:rFonts w:ascii="Consolas" w:cs="Consolas" w:eastAsia="Consolas" w:hAnsi="Consolas"/>
-                <w:sz w:val="17"/>
-                <w:szCs w:val="17"/>
-              </w:rPr>
-              <w:t xml:space="preserve">Example SUM ≥ 150 mm / 24 h: count 24, each = 150 × 1.10 ÷ 24 = 6.875 mm</w:t>
-            </w:r>
-          </w:p>
-          <w:p>
-            <w:r>
-              <w:rPr>
-                <w:rFonts w:ascii="Consolas" w:cs="Consolas" w:eastAsia="Consolas" w:hAnsi="Consolas"/>
-                <w:sz w:val="17"/>
-                <w:szCs w:val="17"/>
-              </w:rPr>
-              <w:t xml:space="preserve">                              SUM = 24 × 6.875 = 165 mm ≥ 150  → MATCHED</w:t>
-            </w:r>
-          </w:p>
-          <w:p>
-            <w:r>
-              <w:rPr>
-                <w:rFonts w:ascii="Consolas" w:cs="Consolas" w:eastAsia="Consolas" w:hAnsi="Consolas"/>
-                <w:sz w:val="17"/>
-                <w:szCs w:val="17"/>
-              </w:rPr>
-              <w:t xml:space="preserve">Example MAX ≥ 5 m: each = 5 × 1.10 = 5.5 m  → MATCHED</w:t>
-            </w:r>
-          </w:p>
-        </w:tc>
-      </w:tr>
-    </w:tbl>
-    <w:p>
-      <w:pPr>
-        <w:spacing w:before="120"/>
-      </w:pPr>
-      <w:r>
-        <w:t xml:space="preserve">Example AVERAGE ≥ 50 mm: every reading = 50 × 1.10 = 55 mm, so the average is 55 mm ≥ 50 → MATCHED. (Only a SUM rule spreads the target across readings.)</w:t>
+        <w:t>7.6 Measurement readings</w:t>
       </w:r>
     </w:p>
     <w:p>
@@ -24002,7 +22960,7 @@
                 <w:sz w:val="19"/>
                 <w:szCs w:val="19"/>
               </w:rPr>
-              <w:t xml:space="preserve">/api/triggers/definitions</w:t>
+              <w:t>GET /api/triggers/definitions/{id}</w:t>
             </w:r>
           </w:p>
         </w:tc>
@@ -24054,7 +23012,7 @@
                 <w:sz w:val="19"/>
                 <w:szCs w:val="19"/>
               </w:rPr>
-              <w:t xml:space="preserve">Per-product-per-zone trigger definitions (versioned, synced from product)</w:t>
+              <w:t>Definition shown on a trigger event (definitions are synced from the product)</w:t>
             </w:r>
           </w:p>
         </w:tc>
@@ -24083,7 +23041,7 @@
                 <w:sz w:val="19"/>
                 <w:szCs w:val="19"/>
               </w:rPr>
-              <w:t xml:space="preserve">GET /internal/triggers/zones/{id}, /internal/triggers/policy/{id}/eligibility</w:t>
+              <w:t>GET /internal/triggers/zones/{id}</w:t>
             </w:r>
           </w:p>
         </w:tc>
@@ -24137,7 +23095,7 @@
                 <w:sz w:val="19"/>
                 <w:szCs w:val="19"/>
               </w:rPr>
-              <w:t xml:space="preserve">Zone validation, claim eligibility</w:t>
+              <w:t>Zone validation</w:t>
             </w:r>
           </w:p>
         </w:tc>

</xml_diff>